<commit_message>
Add the GitHub link to the reports
Co-Authored-By: Claude Opus 5.5 <noreply@anthropic.com>
</commit_message>
<xml_diff>
--- a/report/PGS-IR-Report.docx
+++ b/report/PGS-IR-Report.docx
@@ -158,9 +158,8 @@
         <w:rPr>
           <w:sz w:val="23"/>
           <w:szCs w:val="23"/>
-          <w:highlight w:val="yellow"/>
-        </w:rPr>
-        <w:t>https://github.com/&lt;your-username&gt;/pgs-ir-assignment</w:t>
+        </w:rPr>
+        <w:t>https://github.com/Prijesh77/pgs-ir-assignment</w:t>
       </w:r>
     </w:p>
     <w:p>
@@ -209,7 +208,7 @@
     <w:sdt>
       <w:sdtPr>
         <w:alias w:val="Contents"/>
-        <w:id w:val="1765335586"/>
+        <w:id w:val="486681743"/>
       </w:sdtPr>
       <w:sdtEndPr/>
       <w:sdtContent>
@@ -232,7 +231,7 @@
           <w:r>
             <w:fldChar w:fldCharType="separate"/>
           </w:r>
-          <w:hyperlink w:anchor="_Toc242696095" w:history="1">
+          <w:hyperlink w:anchor="_Toc242699548" w:history="1">
             <w:r>
               <w:rPr>
                 <w:rStyle w:val="Hyperlink"/>
@@ -256,7 +255,7 @@
               <w:rPr>
                 <w:noProof/>
               </w:rPr>
-              <w:instrText xml:space="preserve"> PAGEREF _Toc242696095 \h </w:instrText>
+              <w:instrText xml:space="preserve"> PAGEREF _Toc242699548 \h </w:instrText>
             </w:r>
             <w:r>
               <w:rPr>
@@ -293,7 +292,7 @@
               <w:noProof/>
             </w:rPr>
           </w:pPr>
-          <w:hyperlink w:anchor="_Toc242696096" w:history="1">
+          <w:hyperlink w:anchor="_Toc242699549" w:history="1">
             <w:r>
               <w:rPr>
                 <w:rStyle w:val="Hyperlink"/>
@@ -317,7 +316,7 @@
               <w:rPr>
                 <w:noProof/>
               </w:rPr>
-              <w:instrText xml:space="preserve"> PAGEREF _Toc242696096 \h </w:instrText>
+              <w:instrText xml:space="preserve"> PAGEREF _Toc242699549 \h </w:instrText>
             </w:r>
             <w:r>
               <w:rPr>
@@ -354,7 +353,7 @@
               <w:noProof/>
             </w:rPr>
           </w:pPr>
-          <w:hyperlink w:anchor="_Toc242696097" w:history="1">
+          <w:hyperlink w:anchor="_Toc242699550" w:history="1">
             <w:r>
               <w:rPr>
                 <w:rStyle w:val="Hyperlink"/>
@@ -378,7 +377,7 @@
               <w:rPr>
                 <w:noProof/>
               </w:rPr>
-              <w:instrText xml:space="preserve"> PAGEREF _Toc242696097 \h </w:instrText>
+              <w:instrText xml:space="preserve"> PAGEREF _Toc242699550 \h </w:instrText>
             </w:r>
             <w:r>
               <w:rPr>
@@ -415,7 +414,7 @@
               <w:noProof/>
             </w:rPr>
           </w:pPr>
-          <w:hyperlink w:anchor="_Toc242696098" w:history="1">
+          <w:hyperlink w:anchor="_Toc242699551" w:history="1">
             <w:r>
               <w:rPr>
                 <w:rStyle w:val="Hyperlink"/>
@@ -439,7 +438,7 @@
               <w:rPr>
                 <w:noProof/>
               </w:rPr>
-              <w:instrText xml:space="preserve"> PAGEREF _Toc242696098 \h </w:instrText>
+              <w:instrText xml:space="preserve"> PAGEREF _Toc242699551 \h </w:instrText>
             </w:r>
             <w:r>
               <w:rPr>
@@ -476,7 +475,7 @@
               <w:noProof/>
             </w:rPr>
           </w:pPr>
-          <w:hyperlink w:anchor="_Toc242696099" w:history="1">
+          <w:hyperlink w:anchor="_Toc242699552" w:history="1">
             <w:r>
               <w:rPr>
                 <w:rStyle w:val="Hyperlink"/>
@@ -500,7 +499,7 @@
               <w:rPr>
                 <w:noProof/>
               </w:rPr>
-              <w:instrText xml:space="preserve"> PAGEREF _Toc242696099 \h </w:instrText>
+              <w:instrText xml:space="preserve"> PAGEREF _Toc242699552 \h </w:instrText>
             </w:r>
             <w:r>
               <w:rPr>
@@ -537,7 +536,7 @@
               <w:noProof/>
             </w:rPr>
           </w:pPr>
-          <w:hyperlink w:anchor="_Toc242696100" w:history="1">
+          <w:hyperlink w:anchor="_Toc242699553" w:history="1">
             <w:r>
               <w:rPr>
                 <w:rStyle w:val="Hyperlink"/>
@@ -561,7 +560,7 @@
               <w:rPr>
                 <w:noProof/>
               </w:rPr>
-              <w:instrText xml:space="preserve"> PAGEREF _Toc242696100 \h </w:instrText>
+              <w:instrText xml:space="preserve"> PAGEREF _Toc242699553 \h </w:instrText>
             </w:r>
             <w:r>
               <w:rPr>
@@ -598,7 +597,7 @@
               <w:noProof/>
             </w:rPr>
           </w:pPr>
-          <w:hyperlink w:anchor="_Toc242696101" w:history="1">
+          <w:hyperlink w:anchor="_Toc242699554" w:history="1">
             <w:r>
               <w:rPr>
                 <w:rStyle w:val="Hyperlink"/>
@@ -622,7 +621,7 @@
               <w:rPr>
                 <w:noProof/>
               </w:rPr>
-              <w:instrText xml:space="preserve"> PAGEREF _Toc242696101 \h </w:instrText>
+              <w:instrText xml:space="preserve"> PAGEREF _Toc242699554 \h </w:instrText>
             </w:r>
             <w:r>
               <w:rPr>
@@ -659,7 +658,7 @@
               <w:noProof/>
             </w:rPr>
           </w:pPr>
-          <w:hyperlink w:anchor="_Toc242696102" w:history="1">
+          <w:hyperlink w:anchor="_Toc242699555" w:history="1">
             <w:r>
               <w:rPr>
                 <w:rStyle w:val="Hyperlink"/>
@@ -683,7 +682,7 @@
               <w:rPr>
                 <w:noProof/>
               </w:rPr>
-              <w:instrText xml:space="preserve"> PAGEREF _Toc242696102 \h </w:instrText>
+              <w:instrText xml:space="preserve"> PAGEREF _Toc242699555 \h </w:instrText>
             </w:r>
             <w:r>
               <w:rPr>
@@ -720,7 +719,7 @@
               <w:noProof/>
             </w:rPr>
           </w:pPr>
-          <w:hyperlink w:anchor="_Toc242696103" w:history="1">
+          <w:hyperlink w:anchor="_Toc242699556" w:history="1">
             <w:r>
               <w:rPr>
                 <w:rStyle w:val="Hyperlink"/>
@@ -744,7 +743,7 @@
               <w:rPr>
                 <w:noProof/>
               </w:rPr>
-              <w:instrText xml:space="preserve"> PAGEREF _Toc242696103 \h </w:instrText>
+              <w:instrText xml:space="preserve"> PAGEREF _Toc242699556 \h </w:instrText>
             </w:r>
             <w:r>
               <w:rPr>
@@ -781,7 +780,7 @@
               <w:noProof/>
             </w:rPr>
           </w:pPr>
-          <w:hyperlink w:anchor="_Toc242696104" w:history="1">
+          <w:hyperlink w:anchor="_Toc242699557" w:history="1">
             <w:r>
               <w:rPr>
                 <w:rStyle w:val="Hyperlink"/>
@@ -805,7 +804,7 @@
               <w:rPr>
                 <w:noProof/>
               </w:rPr>
-              <w:instrText xml:space="preserve"> PAGEREF _Toc242696104 \h </w:instrText>
+              <w:instrText xml:space="preserve"> PAGEREF _Toc242699557 \h </w:instrText>
             </w:r>
             <w:r>
               <w:rPr>
@@ -842,7 +841,7 @@
               <w:noProof/>
             </w:rPr>
           </w:pPr>
-          <w:hyperlink w:anchor="_Toc242696105" w:history="1">
+          <w:hyperlink w:anchor="_Toc242699558" w:history="1">
             <w:r>
               <w:rPr>
                 <w:rStyle w:val="Hyperlink"/>
@@ -866,7 +865,7 @@
               <w:rPr>
                 <w:noProof/>
               </w:rPr>
-              <w:instrText xml:space="preserve"> PAGEREF _Toc242696105 \h </w:instrText>
+              <w:instrText xml:space="preserve"> PAGEREF _Toc242699558 \h </w:instrText>
             </w:r>
             <w:r>
               <w:rPr>
@@ -903,7 +902,7 @@
               <w:noProof/>
             </w:rPr>
           </w:pPr>
-          <w:hyperlink w:anchor="_Toc242696106" w:history="1">
+          <w:hyperlink w:anchor="_Toc242699559" w:history="1">
             <w:r>
               <w:rPr>
                 <w:rStyle w:val="Hyperlink"/>
@@ -927,7 +926,7 @@
               <w:rPr>
                 <w:noProof/>
               </w:rPr>
-              <w:instrText xml:space="preserve"> PAGEREF _Toc242696106 \h </w:instrText>
+              <w:instrText xml:space="preserve"> PAGEREF _Toc242699559 \h </w:instrText>
             </w:r>
             <w:r>
               <w:rPr>
@@ -964,7 +963,7 @@
               <w:noProof/>
             </w:rPr>
           </w:pPr>
-          <w:hyperlink w:anchor="_Toc242696107" w:history="1">
+          <w:hyperlink w:anchor="_Toc242699560" w:history="1">
             <w:r>
               <w:rPr>
                 <w:rStyle w:val="Hyperlink"/>
@@ -988,7 +987,7 @@
               <w:rPr>
                 <w:noProof/>
               </w:rPr>
-              <w:instrText xml:space="preserve"> PAGEREF _Toc242696107 \h </w:instrText>
+              <w:instrText xml:space="preserve"> PAGEREF _Toc242699560 \h </w:instrText>
             </w:r>
             <w:r>
               <w:rPr>
@@ -1025,7 +1024,7 @@
               <w:noProof/>
             </w:rPr>
           </w:pPr>
-          <w:hyperlink w:anchor="_Toc242696108" w:history="1">
+          <w:hyperlink w:anchor="_Toc242699561" w:history="1">
             <w:r>
               <w:rPr>
                 <w:rStyle w:val="Hyperlink"/>
@@ -1049,7 +1048,7 @@
               <w:rPr>
                 <w:noProof/>
               </w:rPr>
-              <w:instrText xml:space="preserve"> PAGEREF _Toc242696108 \h </w:instrText>
+              <w:instrText xml:space="preserve"> PAGEREF _Toc242699561 \h </w:instrText>
             </w:r>
             <w:r>
               <w:rPr>
@@ -1086,7 +1085,7 @@
               <w:noProof/>
             </w:rPr>
           </w:pPr>
-          <w:hyperlink w:anchor="_Toc242696109" w:history="1">
+          <w:hyperlink w:anchor="_Toc242699562" w:history="1">
             <w:r>
               <w:rPr>
                 <w:rStyle w:val="Hyperlink"/>
@@ -1110,7 +1109,7 @@
               <w:rPr>
                 <w:noProof/>
               </w:rPr>
-              <w:instrText xml:space="preserve"> PAGEREF _Toc242696109 \h </w:instrText>
+              <w:instrText xml:space="preserve"> PAGEREF _Toc242699562 \h </w:instrText>
             </w:r>
             <w:r>
               <w:rPr>
@@ -1147,7 +1146,7 @@
               <w:noProof/>
             </w:rPr>
           </w:pPr>
-          <w:hyperlink w:anchor="_Toc242696110" w:history="1">
+          <w:hyperlink w:anchor="_Toc242699563" w:history="1">
             <w:r>
               <w:rPr>
                 <w:rStyle w:val="Hyperlink"/>
@@ -1171,7 +1170,7 @@
               <w:rPr>
                 <w:noProof/>
               </w:rPr>
-              <w:instrText xml:space="preserve"> PAGEREF _Toc242696110 \h </w:instrText>
+              <w:instrText xml:space="preserve"> PAGEREF _Toc242699563 \h </w:instrText>
             </w:r>
             <w:r>
               <w:rPr>
@@ -1208,7 +1207,7 @@
               <w:noProof/>
             </w:rPr>
           </w:pPr>
-          <w:hyperlink w:anchor="_Toc242696111" w:history="1">
+          <w:hyperlink w:anchor="_Toc242699564" w:history="1">
             <w:r>
               <w:rPr>
                 <w:rStyle w:val="Hyperlink"/>
@@ -1232,7 +1231,7 @@
               <w:rPr>
                 <w:noProof/>
               </w:rPr>
-              <w:instrText xml:space="preserve"> PAGEREF _Toc242696111 \h </w:instrText>
+              <w:instrText xml:space="preserve"> PAGEREF _Toc242699564 \h </w:instrText>
             </w:r>
             <w:r>
               <w:rPr>
@@ -1269,7 +1268,7 @@
               <w:noProof/>
             </w:rPr>
           </w:pPr>
-          <w:hyperlink w:anchor="_Toc242696112" w:history="1">
+          <w:hyperlink w:anchor="_Toc242699565" w:history="1">
             <w:r>
               <w:rPr>
                 <w:rStyle w:val="Hyperlink"/>
@@ -1293,7 +1292,7 @@
               <w:rPr>
                 <w:noProof/>
               </w:rPr>
-              <w:instrText xml:space="preserve"> PAGEREF _Toc242696112 \h </w:instrText>
+              <w:instrText xml:space="preserve"> PAGEREF _Toc242699565 \h </w:instrText>
             </w:r>
             <w:r>
               <w:rPr>
@@ -1330,7 +1329,7 @@
               <w:noProof/>
             </w:rPr>
           </w:pPr>
-          <w:hyperlink w:anchor="_Toc242696113" w:history="1">
+          <w:hyperlink w:anchor="_Toc242699566" w:history="1">
             <w:r>
               <w:rPr>
                 <w:rStyle w:val="Hyperlink"/>
@@ -1354,7 +1353,7 @@
               <w:rPr>
                 <w:noProof/>
               </w:rPr>
-              <w:instrText xml:space="preserve"> PAGEREF _Toc242696113 \h </w:instrText>
+              <w:instrText xml:space="preserve"> PAGEREF _Toc242699566 \h </w:instrText>
             </w:r>
             <w:r>
               <w:rPr>
@@ -1391,7 +1390,7 @@
               <w:noProof/>
             </w:rPr>
           </w:pPr>
-          <w:hyperlink w:anchor="_Toc242696114" w:history="1">
+          <w:hyperlink w:anchor="_Toc242699567" w:history="1">
             <w:r>
               <w:rPr>
                 <w:rStyle w:val="Hyperlink"/>
@@ -1415,7 +1414,7 @@
               <w:rPr>
                 <w:noProof/>
               </w:rPr>
-              <w:instrText xml:space="preserve"> PAGEREF _Toc242696114 \h </w:instrText>
+              <w:instrText xml:space="preserve"> PAGEREF _Toc242699567 \h </w:instrText>
             </w:r>
             <w:r>
               <w:rPr>
@@ -1452,7 +1451,7 @@
               <w:noProof/>
             </w:rPr>
           </w:pPr>
-          <w:hyperlink w:anchor="_Toc242696115" w:history="1">
+          <w:hyperlink w:anchor="_Toc242699568" w:history="1">
             <w:r>
               <w:rPr>
                 <w:rStyle w:val="Hyperlink"/>
@@ -1476,7 +1475,7 @@
               <w:rPr>
                 <w:noProof/>
               </w:rPr>
-              <w:instrText xml:space="preserve"> PAGEREF _Toc242696115 \h </w:instrText>
+              <w:instrText xml:space="preserve"> PAGEREF _Toc242699568 \h </w:instrText>
             </w:r>
             <w:r>
               <w:rPr>
@@ -1513,7 +1512,7 @@
               <w:noProof/>
             </w:rPr>
           </w:pPr>
-          <w:hyperlink w:anchor="_Toc242696116" w:history="1">
+          <w:hyperlink w:anchor="_Toc242699569" w:history="1">
             <w:r>
               <w:rPr>
                 <w:rStyle w:val="Hyperlink"/>
@@ -1537,7 +1536,7 @@
               <w:rPr>
                 <w:noProof/>
               </w:rPr>
-              <w:instrText xml:space="preserve"> PAGEREF _Toc242696116 \h </w:instrText>
+              <w:instrText xml:space="preserve"> PAGEREF _Toc242699569 \h </w:instrText>
             </w:r>
             <w:r>
               <w:rPr>
@@ -1574,7 +1573,7 @@
               <w:noProof/>
             </w:rPr>
           </w:pPr>
-          <w:hyperlink w:anchor="_Toc242696117" w:history="1">
+          <w:hyperlink w:anchor="_Toc242699570" w:history="1">
             <w:r>
               <w:rPr>
                 <w:rStyle w:val="Hyperlink"/>
@@ -1598,7 +1597,7 @@
               <w:rPr>
                 <w:noProof/>
               </w:rPr>
-              <w:instrText xml:space="preserve"> PAGEREF _Toc242696117 \h </w:instrText>
+              <w:instrText xml:space="preserve"> PAGEREF _Toc242699570 \h </w:instrText>
             </w:r>
             <w:r>
               <w:rPr>
@@ -1635,7 +1634,7 @@
               <w:noProof/>
             </w:rPr>
           </w:pPr>
-          <w:hyperlink w:anchor="_Toc242696118" w:history="1">
+          <w:hyperlink w:anchor="_Toc242699571" w:history="1">
             <w:r>
               <w:rPr>
                 <w:rStyle w:val="Hyperlink"/>
@@ -1659,7 +1658,7 @@
               <w:rPr>
                 <w:noProof/>
               </w:rPr>
-              <w:instrText xml:space="preserve"> PAGEREF _Toc242696118 \h </w:instrText>
+              <w:instrText xml:space="preserve"> PAGEREF _Toc242699571 \h </w:instrText>
             </w:r>
             <w:r>
               <w:rPr>
@@ -1696,7 +1695,7 @@
               <w:noProof/>
             </w:rPr>
           </w:pPr>
-          <w:hyperlink w:anchor="_Toc242696119" w:history="1">
+          <w:hyperlink w:anchor="_Toc242699572" w:history="1">
             <w:r>
               <w:rPr>
                 <w:rStyle w:val="Hyperlink"/>
@@ -1720,7 +1719,7 @@
               <w:rPr>
                 <w:noProof/>
               </w:rPr>
-              <w:instrText xml:space="preserve"> PAGEREF _Toc242696119 \h </w:instrText>
+              <w:instrText xml:space="preserve"> PAGEREF _Toc242699572 \h </w:instrText>
             </w:r>
             <w:r>
               <w:rPr>
@@ -1757,7 +1756,7 @@
               <w:noProof/>
             </w:rPr>
           </w:pPr>
-          <w:hyperlink w:anchor="_Toc242696120" w:history="1">
+          <w:hyperlink w:anchor="_Toc242699573" w:history="1">
             <w:r>
               <w:rPr>
                 <w:rStyle w:val="Hyperlink"/>
@@ -1781,7 +1780,7 @@
               <w:rPr>
                 <w:noProof/>
               </w:rPr>
-              <w:instrText xml:space="preserve"> PAGEREF _Toc242696120 \h </w:instrText>
+              <w:instrText xml:space="preserve"> PAGEREF _Toc242699573 \h </w:instrText>
             </w:r>
             <w:r>
               <w:rPr>
@@ -1818,7 +1817,7 @@
               <w:noProof/>
             </w:rPr>
           </w:pPr>
-          <w:hyperlink w:anchor="_Toc242696121" w:history="1">
+          <w:hyperlink w:anchor="_Toc242699574" w:history="1">
             <w:r>
               <w:rPr>
                 <w:rStyle w:val="Hyperlink"/>
@@ -1842,7 +1841,7 @@
               <w:rPr>
                 <w:noProof/>
               </w:rPr>
-              <w:instrText xml:space="preserve"> PAGEREF _Toc242696121 \h </w:instrText>
+              <w:instrText xml:space="preserve"> PAGEREF _Toc242699574 \h </w:instrText>
             </w:r>
             <w:r>
               <w:rPr>
@@ -1879,7 +1878,7 @@
               <w:noProof/>
             </w:rPr>
           </w:pPr>
-          <w:hyperlink w:anchor="_Toc242696122" w:history="1">
+          <w:hyperlink w:anchor="_Toc242699575" w:history="1">
             <w:r>
               <w:rPr>
                 <w:rStyle w:val="Hyperlink"/>
@@ -1903,7 +1902,7 @@
               <w:rPr>
                 <w:noProof/>
               </w:rPr>
-              <w:instrText xml:space="preserve"> PAGEREF _Toc242696122 \h </w:instrText>
+              <w:instrText xml:space="preserve"> PAGEREF _Toc242699575 \h </w:instrText>
             </w:r>
             <w:r>
               <w:rPr>
@@ -1940,7 +1939,7 @@
               <w:noProof/>
             </w:rPr>
           </w:pPr>
-          <w:hyperlink w:anchor="_Toc242696123" w:history="1">
+          <w:hyperlink w:anchor="_Toc242699576" w:history="1">
             <w:r>
               <w:rPr>
                 <w:rStyle w:val="Hyperlink"/>
@@ -1964,7 +1963,7 @@
               <w:rPr>
                 <w:noProof/>
               </w:rPr>
-              <w:instrText xml:space="preserve"> PAGEREF _Toc242696123 \h </w:instrText>
+              <w:instrText xml:space="preserve"> PAGEREF _Toc242699576 \h </w:instrText>
             </w:r>
             <w:r>
               <w:rPr>
@@ -2001,7 +2000,7 @@
               <w:noProof/>
             </w:rPr>
           </w:pPr>
-          <w:hyperlink w:anchor="_Toc242696124" w:history="1">
+          <w:hyperlink w:anchor="_Toc242699577" w:history="1">
             <w:r>
               <w:rPr>
                 <w:rStyle w:val="Hyperlink"/>
@@ -2025,7 +2024,7 @@
               <w:rPr>
                 <w:noProof/>
               </w:rPr>
-              <w:instrText xml:space="preserve"> PAGEREF _Toc242696124 \h </w:instrText>
+              <w:instrText xml:space="preserve"> PAGEREF _Toc242699577 \h </w:instrText>
             </w:r>
             <w:r>
               <w:rPr>
@@ -2062,7 +2061,7 @@
               <w:noProof/>
             </w:rPr>
           </w:pPr>
-          <w:hyperlink w:anchor="_Toc242696125" w:history="1">
+          <w:hyperlink w:anchor="_Toc242699578" w:history="1">
             <w:r>
               <w:rPr>
                 <w:rStyle w:val="Hyperlink"/>
@@ -2086,7 +2085,7 @@
               <w:rPr>
                 <w:noProof/>
               </w:rPr>
-              <w:instrText xml:space="preserve"> PAGEREF _Toc242696125 \h </w:instrText>
+              <w:instrText xml:space="preserve"> PAGEREF _Toc242699578 \h </w:instrText>
             </w:r>
             <w:r>
               <w:rPr>
@@ -2123,7 +2122,7 @@
               <w:noProof/>
             </w:rPr>
           </w:pPr>
-          <w:hyperlink w:anchor="_Toc242696126" w:history="1">
+          <w:hyperlink w:anchor="_Toc242699579" w:history="1">
             <w:r>
               <w:rPr>
                 <w:rStyle w:val="Hyperlink"/>
@@ -2147,7 +2146,7 @@
               <w:rPr>
                 <w:noProof/>
               </w:rPr>
-              <w:instrText xml:space="preserve"> PAGEREF _Toc242696126 \h </w:instrText>
+              <w:instrText xml:space="preserve"> PAGEREF _Toc242699579 \h </w:instrText>
             </w:r>
             <w:r>
               <w:rPr>
@@ -2184,7 +2183,7 @@
               <w:noProof/>
             </w:rPr>
           </w:pPr>
-          <w:hyperlink w:anchor="_Toc242696127" w:history="1">
+          <w:hyperlink w:anchor="_Toc242699580" w:history="1">
             <w:r>
               <w:rPr>
                 <w:rStyle w:val="Hyperlink"/>
@@ -2208,7 +2207,7 @@
               <w:rPr>
                 <w:noProof/>
               </w:rPr>
-              <w:instrText xml:space="preserve"> PAGEREF _Toc242696127 \h </w:instrText>
+              <w:instrText xml:space="preserve"> PAGEREF _Toc242699580 \h </w:instrText>
             </w:r>
             <w:r>
               <w:rPr>
@@ -2245,7 +2244,7 @@
               <w:noProof/>
             </w:rPr>
           </w:pPr>
-          <w:hyperlink w:anchor="_Toc242696128" w:history="1">
+          <w:hyperlink w:anchor="_Toc242699581" w:history="1">
             <w:r>
               <w:rPr>
                 <w:rStyle w:val="Hyperlink"/>
@@ -2269,7 +2268,7 @@
               <w:rPr>
                 <w:noProof/>
               </w:rPr>
-              <w:instrText xml:space="preserve"> PAGEREF _Toc242696128 \h </w:instrText>
+              <w:instrText xml:space="preserve"> PAGEREF _Toc242699581 \h </w:instrText>
             </w:r>
             <w:r>
               <w:rPr>
@@ -2306,7 +2305,7 @@
               <w:noProof/>
             </w:rPr>
           </w:pPr>
-          <w:hyperlink w:anchor="_Toc242696129" w:history="1">
+          <w:hyperlink w:anchor="_Toc242699582" w:history="1">
             <w:r>
               <w:rPr>
                 <w:rStyle w:val="Hyperlink"/>
@@ -2330,7 +2329,7 @@
               <w:rPr>
                 <w:noProof/>
               </w:rPr>
-              <w:instrText xml:space="preserve"> PAGEREF _Toc242696129 \h </w:instrText>
+              <w:instrText xml:space="preserve"> PAGEREF _Toc242699582 \h </w:instrText>
             </w:r>
             <w:r>
               <w:rPr>
@@ -2367,7 +2366,7 @@
               <w:noProof/>
             </w:rPr>
           </w:pPr>
-          <w:hyperlink w:anchor="_Toc242696130" w:history="1">
+          <w:hyperlink w:anchor="_Toc242699583" w:history="1">
             <w:r>
               <w:rPr>
                 <w:rStyle w:val="Hyperlink"/>
@@ -2391,7 +2390,7 @@
               <w:rPr>
                 <w:noProof/>
               </w:rPr>
-              <w:instrText xml:space="preserve"> PAGEREF _Toc242696130 \h </w:instrText>
+              <w:instrText xml:space="preserve"> PAGEREF _Toc242699583 \h </w:instrText>
             </w:r>
             <w:r>
               <w:rPr>
@@ -2430,7 +2429,7 @@
         <w:pStyle w:val="Heading1"/>
         <w:pageBreakBefore/>
       </w:pPr>
-      <w:bookmarkStart w:id="0" w:name="_Toc242696095"/>
+      <w:bookmarkStart w:id="0" w:name="_Toc242699548"/>
       <w:r>
         <w:lastRenderedPageBreak/>
         <w:t>1. Introduction</w:t>
@@ -2477,7 +2476,7 @@
       <w:pPr>
         <w:pStyle w:val="Heading2"/>
       </w:pPr>
-      <w:bookmarkStart w:id="1" w:name="_Toc242696096"/>
+      <w:bookmarkStart w:id="1" w:name="_Toc242699549"/>
       <w:r>
         <w:t>1.1 Goals</w:t>
       </w:r>
@@ -2592,7 +2591,7 @@
       <w:pPr>
         <w:pStyle w:val="Heading2"/>
       </w:pPr>
-      <w:bookmarkStart w:id="2" w:name="_Toc242696097"/>
+      <w:bookmarkStart w:id="2" w:name="_Toc242699550"/>
       <w:r>
         <w:t>1.2 Summary of results</w:t>
       </w:r>
@@ -2621,7 +2620,7 @@
         <w:pStyle w:val="Heading1"/>
         <w:pageBreakBefore/>
       </w:pPr>
-      <w:bookmarkStart w:id="3" w:name="_Toc242696098"/>
+      <w:bookmarkStart w:id="3" w:name="_Toc242699551"/>
       <w:r>
         <w:lastRenderedPageBreak/>
         <w:t>2. Dataset</w:t>
@@ -3508,7 +3507,7 @@
       <w:pPr>
         <w:pStyle w:val="Heading2"/>
       </w:pPr>
-      <w:bookmarkStart w:id="4" w:name="_Toc242696099"/>
+      <w:bookmarkStart w:id="4" w:name="_Toc242699552"/>
       <w:r>
         <w:t>2.1 Document structure</w:t>
       </w:r>
@@ -4296,7 +4295,7 @@
       <w:pPr>
         <w:pStyle w:val="Heading2"/>
       </w:pPr>
-      <w:bookmarkStart w:id="5" w:name="_Toc242696100"/>
+      <w:bookmarkStart w:id="5" w:name="_Toc242699553"/>
       <w:r>
         <w:t>2.2 Why this dataset</w:t>
       </w:r>
@@ -4379,7 +4378,7 @@
         <w:pStyle w:val="Heading1"/>
         <w:pageBreakBefore/>
       </w:pPr>
-      <w:bookmarkStart w:id="6" w:name="_Toc242696101"/>
+      <w:bookmarkStart w:id="6" w:name="_Toc242699554"/>
       <w:r>
         <w:lastRenderedPageBreak/>
         <w:t>3. System design</w:t>
@@ -4425,7 +4424,7 @@
           <w:noProof/>
         </w:rPr>
         <w:drawing>
-          <wp:inline distT="0" distB="0" distL="0" distR="0" wp14:anchorId="66D73E36" wp14:editId="6A7A93B4">
+          <wp:inline distT="0" distB="0" distL="0" distR="0" wp14:anchorId="43E63BF9" wp14:editId="7297989E">
             <wp:extent cx="5715000" cy="2543175"/>
             <wp:effectExtent l="0" t="0" r="0" b="0"/>
             <wp:docPr id="1" name="architecture" descr="System architecture: indexing, searching and evaluation." title="System architecture: indexing, searching and evaluation."/>
@@ -4492,7 +4491,7 @@
       <w:pPr>
         <w:pStyle w:val="Heading2"/>
       </w:pPr>
-      <w:bookmarkStart w:id="7" w:name="_Toc242696102"/>
+      <w:bookmarkStart w:id="7" w:name="_Toc242699555"/>
       <w:r>
         <w:t>3.1 Preprocessing</w:t>
       </w:r>
@@ -5882,7 +5881,7 @@
       <w:pPr>
         <w:pStyle w:val="Heading2"/>
       </w:pPr>
-      <w:bookmarkStart w:id="8" w:name="_Toc242696103"/>
+      <w:bookmarkStart w:id="8" w:name="_Toc242699556"/>
       <w:r>
         <w:t>3.2 Indexing</w:t>
       </w:r>
@@ -6456,7 +6455,7 @@
       <w:pPr>
         <w:pStyle w:val="Heading2"/>
       </w:pPr>
-      <w:bookmarkStart w:id="9" w:name="_Toc242696104"/>
+      <w:bookmarkStart w:id="9" w:name="_Toc242699557"/>
       <w:r>
         <w:t>3.3 Retrieval models</w:t>
       </w:r>
@@ -6781,7 +6780,7 @@
       <w:pPr>
         <w:pStyle w:val="Heading2"/>
       </w:pPr>
-      <w:bookmarkStart w:id="10" w:name="_Toc242696105"/>
+      <w:bookmarkStart w:id="10" w:name="_Toc242699558"/>
       <w:r>
         <w:t>3.4 Query processing</w:t>
       </w:r>
@@ -7136,7 +7135,7 @@
         <w:pStyle w:val="Heading1"/>
         <w:pageBreakBefore/>
       </w:pPr>
-      <w:bookmarkStart w:id="11" w:name="_Toc242696106"/>
+      <w:bookmarkStart w:id="11" w:name="_Toc242699559"/>
       <w:r>
         <w:lastRenderedPageBreak/>
         <w:t>4. Implementation</w:t>
@@ -8120,7 +8119,7 @@
       <w:pPr>
         <w:pStyle w:val="Heading2"/>
       </w:pPr>
-      <w:bookmarkStart w:id="12" w:name="_Toc242696107"/>
+      <w:bookmarkStart w:id="12" w:name="_Toc242699560"/>
       <w:r>
         <w:t>4.1 Building the index</w:t>
       </w:r>
@@ -8154,7 +8153,7 @@
           <w:noProof/>
         </w:rPr>
         <w:drawing>
-          <wp:inline distT="0" distB="0" distL="0" distR="0" wp14:anchorId="7B81446B" wp14:editId="292AA985">
+          <wp:inline distT="0" distB="0" distL="0" distR="0" wp14:anchorId="3CC6EB72" wp14:editId="36434C9B">
             <wp:extent cx="5715000" cy="1152525"/>
             <wp:effectExtent l="0" t="0" r="0" b="0"/>
             <wp:docPr id="2" name="run_build" descr="Building the index." title="Building the index."/>
@@ -8229,7 +8228,7 @@
         </w:rPr>
         <w:lastRenderedPageBreak/>
         <w:drawing>
-          <wp:inline distT="0" distB="0" distL="0" distR="0" wp14:anchorId="64B6157A" wp14:editId="3862D212">
+          <wp:inline distT="0" distB="0" distL="0" distR="0" wp14:anchorId="4EDEA821" wp14:editId="4EE4E150">
             <wp:extent cx="5715000" cy="2438400"/>
             <wp:effectExtent l="0" t="0" r="0" b="0"/>
             <wp:docPr id="3" name="code_index_build" descr="Index construction: every field of every document is analysed and its term counts are added to the postings." title="Index construction: every field of every document is analysed and its term counts are added to the postings."/>
@@ -8296,7 +8295,7 @@
       <w:pPr>
         <w:pStyle w:val="Heading2"/>
       </w:pPr>
-      <w:bookmarkStart w:id="13" w:name="_Toc242696108"/>
+      <w:bookmarkStart w:id="13" w:name="_Toc242699561"/>
       <w:r>
         <w:t>4.2 Preprocessing code</w:t>
       </w:r>
@@ -8342,7 +8341,7 @@
           <w:noProof/>
         </w:rPr>
         <w:drawing>
-          <wp:inline distT="0" distB="0" distL="0" distR="0" wp14:anchorId="4221D3D5" wp14:editId="26C85D4F">
+          <wp:inline distT="0" distB="0" distL="0" distR="0" wp14:anchorId="3DA4A669" wp14:editId="7090D6A5">
             <wp:extent cx="5715000" cy="3343275"/>
             <wp:effectExtent l="0" t="0" r="0" b="0"/>
             <wp:docPr id="4" name="code_analyse" descr="Nepali stemming and the analysis pipeline." title="Nepali stemming and the analysis pipeline."/>
@@ -8449,7 +8448,7 @@
         </w:rPr>
         <w:lastRenderedPageBreak/>
         <w:drawing>
-          <wp:inline distT="0" distB="0" distL="0" distR="0" wp14:anchorId="6FB06BC0" wp14:editId="5E228C99">
+          <wp:inline distT="0" distB="0" distL="0" distR="0" wp14:anchorId="7F87633C" wp14:editId="07F6F933">
             <wp:extent cx="5715000" cy="3228975"/>
             <wp:effectExtent l="0" t="0" r="0" b="0"/>
             <wp:docPr id="5" name="code_segmenter" descr="Word segmentation of web addresses by dynamic programming." title="Word segmentation of web addresses by dynamic programming."/>
@@ -8516,7 +8515,7 @@
       <w:pPr>
         <w:pStyle w:val="Heading2"/>
       </w:pPr>
-      <w:bookmarkStart w:id="14" w:name="_Toc242696109"/>
+      <w:bookmarkStart w:id="14" w:name="_Toc242699562"/>
       <w:r>
         <w:t>4.3 Retrieval models code</w:t>
       </w:r>
@@ -8533,7 +8532,7 @@
           <w:noProof/>
         </w:rPr>
         <w:drawing>
-          <wp:inline distT="0" distB="0" distL="0" distR="0" wp14:anchorId="6E78C07E" wp14:editId="297D85BB">
+          <wp:inline distT="0" distB="0" distL="0" distR="0" wp14:anchorId="28C2CB82" wp14:editId="5405F39F">
             <wp:extent cx="5715000" cy="2343150"/>
             <wp:effectExtent l="0" t="0" r="0" b="0"/>
             <wp:docPr id="6" name="code_boolean" descr="Boolean retrieval: intersect from the shortest postings list, then subtract NOT terms." title="Boolean retrieval: intersect from the shortest postings list, then subtract NOT terms."/>
@@ -8608,7 +8607,7 @@
         </w:rPr>
         <w:lastRenderedPageBreak/>
         <w:drawing>
-          <wp:inline distT="0" distB="0" distL="0" distR="0" wp14:anchorId="4F801666" wp14:editId="7FE81B1F">
+          <wp:inline distT="0" distB="0" distL="0" distR="0" wp14:anchorId="035FF9DA" wp14:editId="1400C091">
             <wp:extent cx="5715000" cy="3543300"/>
             <wp:effectExtent l="0" t="0" r="0" b="0"/>
             <wp:docPr id="7" name="code_tfidf_rrf" descr="TF-IDF cosine scoring and Reciprocal Rank Fusion." title="TF-IDF cosine scoring and Reciprocal Rank Fusion."/>
@@ -8682,7 +8681,7 @@
           <w:noProof/>
         </w:rPr>
         <w:drawing>
-          <wp:inline distT="0" distB="0" distL="0" distR="0" wp14:anchorId="06656CD3" wp14:editId="7C0C982A">
+          <wp:inline distT="0" distB="0" distL="0" distR="0" wp14:anchorId="7BE84022" wp14:editId="17F140CE">
             <wp:extent cx="5715000" cy="2752725"/>
             <wp:effectExtent l="0" t="0" r="0" b="0"/>
             <wp:docPr id="8" name="code_bm25" descr="BM25F: field-weighted, length-normalised term frequency, then BM25 saturation." title="BM25F: field-weighted, length-normalised term frequency, then BM25 saturation."/>
@@ -8749,7 +8748,7 @@
       <w:pPr>
         <w:pStyle w:val="Heading2"/>
       </w:pPr>
-      <w:bookmarkStart w:id="15" w:name="_Toc242696110"/>
+      <w:bookmarkStart w:id="15" w:name="_Toc242699563"/>
       <w:r>
         <w:lastRenderedPageBreak/>
         <w:t>4.4 Query processing code</w:t>
@@ -8767,7 +8766,7 @@
           <w:noProof/>
         </w:rPr>
         <w:drawing>
-          <wp:inline distT="0" distB="0" distL="0" distR="0" wp14:anchorId="0A368856" wp14:editId="6918EF21">
+          <wp:inline distT="0" distB="0" distL="0" distR="0" wp14:anchorId="1D4FDA68" wp14:editId="1B7A8AC5">
             <wp:extent cx="5715000" cy="6591300"/>
             <wp:effectExtent l="0" t="0" r="0" b="0"/>
             <wp:docPr id="9" name="code_query" descr="Query processing: validation, filters, Boolean operators, spelling correction and translation." title="Query processing: validation, filters, Boolean operators, spelling correction and translation."/>
@@ -8835,7 +8834,7 @@
         <w:pStyle w:val="Heading1"/>
         <w:pageBreakBefore/>
       </w:pPr>
-      <w:bookmarkStart w:id="16" w:name="_Toc242696111"/>
+      <w:bookmarkStart w:id="16" w:name="_Toc242699564"/>
       <w:r>
         <w:lastRenderedPageBreak/>
         <w:t>5. Results: example searches</w:t>
@@ -8866,7 +8865,7 @@
       <w:pPr>
         <w:pStyle w:val="Heading2"/>
       </w:pPr>
-      <w:bookmarkStart w:id="17" w:name="_Toc242696112"/>
+      <w:bookmarkStart w:id="17" w:name="_Toc242699565"/>
       <w:r>
         <w:t>5.1 An English query</w:t>
       </w:r>
@@ -8963,7 +8962,7 @@
           <w:noProof/>
         </w:rPr>
         <w:drawing>
-          <wp:inline distT="0" distB="0" distL="0" distR="0" wp14:anchorId="7C9AC569" wp14:editId="58945A15">
+          <wp:inline distT="0" distB="0" distL="0" distR="0" wp14:anchorId="472A69E1" wp14:editId="412CAD10">
             <wp:extent cx="5715000" cy="1943100"/>
             <wp:effectExtent l="0" t="0" r="0" b="0"/>
             <wp:docPr id="10" name="run_pokhara_news" descr="BM25F results for “pokhara news”." title="BM25F results for “pokhara news”."/>
@@ -9030,7 +9029,7 @@
       <w:pPr>
         <w:pStyle w:val="Heading2"/>
       </w:pPr>
-      <w:bookmarkStart w:id="18" w:name="_Toc242696113"/>
+      <w:bookmarkStart w:id="18" w:name="_Toc242699566"/>
       <w:r>
         <w:t>5.2 A Nepali query</w:t>
       </w:r>
@@ -9115,7 +9114,7 @@
           <w:noProof/>
         </w:rPr>
         <w:drawing>
-          <wp:inline distT="0" distB="0" distL="0" distR="0" wp14:anchorId="4E50CB18" wp14:editId="0C8C2E0A">
+          <wp:inline distT="0" distB="0" distL="0" distR="0" wp14:anchorId="69F80DDC" wp14:editId="6C38A2F6">
             <wp:extent cx="5715000" cy="1552575"/>
             <wp:effectExtent l="0" t="0" r="0" b="0"/>
             <wp:docPr id="11" name="run_nepali" descr="A Nepali query returns Kaski’s local governments." title="A Nepali query returns Kaski’s local governments."/>
@@ -9182,7 +9181,7 @@
       <w:pPr>
         <w:pStyle w:val="Heading2"/>
       </w:pPr>
-      <w:bookmarkStart w:id="19" w:name="_Toc242696114"/>
+      <w:bookmarkStart w:id="19" w:name="_Toc242699567"/>
       <w:r>
         <w:t>5.3 A misspelt query</w:t>
       </w:r>
@@ -9220,7 +9219,7 @@
         </w:rPr>
         <w:lastRenderedPageBreak/>
         <w:drawing>
-          <wp:inline distT="0" distB="0" distL="0" distR="0" wp14:anchorId="78CEF2B2" wp14:editId="3641984A">
+          <wp:inline distT="0" distB="0" distL="0" distR="0" wp14:anchorId="53D0A2BD" wp14:editId="060011BE">
             <wp:extent cx="5715000" cy="1552575"/>
             <wp:effectExtent l="0" t="0" r="0" b="0"/>
             <wp:docPr id="12" name="run_typo" descr="Spelling correction: pokhra → pokhara → पोखरा." title="Spelling correction: pokhra → pokhara → पोखरा."/>
@@ -9303,7 +9302,7 @@
       <w:pPr>
         <w:pStyle w:val="Heading2"/>
       </w:pPr>
-      <w:bookmarkStart w:id="20" w:name="_Toc242696115"/>
+      <w:bookmarkStart w:id="20" w:name="_Toc242699568"/>
       <w:r>
         <w:t>5.4 A place filter and the hybrid model</w:t>
       </w:r>
@@ -9328,7 +9327,7 @@
           <w:noProof/>
         </w:rPr>
         <w:drawing>
-          <wp:inline distT="0" distB="0" distL="0" distR="0" wp14:anchorId="0D7C3204" wp14:editId="709782D7">
+          <wp:inline distT="0" distB="0" distL="0" distR="0" wp14:anchorId="4BB55AC6" wp14:editId="076832FA">
             <wp:extent cx="5715000" cy="1647825"/>
             <wp:effectExtent l="0" t="0" r="0" b="0"/>
             <wp:docPr id="13" name="run_filter_hybrid" descr="District filter with the hybrid (RRF) model." title="District filter with the hybrid (RRF) model."/>
@@ -9395,7 +9394,7 @@
       <w:pPr>
         <w:pStyle w:val="Heading2"/>
       </w:pPr>
-      <w:bookmarkStart w:id="21" w:name="_Toc242696116"/>
+      <w:bookmarkStart w:id="21" w:name="_Toc242699569"/>
       <w:r>
         <w:t>5.5 Boolean operators</w:t>
       </w:r>
@@ -9412,7 +9411,7 @@
           <w:noProof/>
         </w:rPr>
         <w:drawing>
-          <wp:inline distT="0" distB="0" distL="0" distR="0" wp14:anchorId="7F836591" wp14:editId="6EDC686E">
+          <wp:inline distT="0" distB="0" distL="0" distR="0" wp14:anchorId="43785A84" wp14:editId="7B354E8B">
             <wp:extent cx="5715000" cy="1257300"/>
             <wp:effectExtent l="0" t="0" r="0" b="0"/>
             <wp:docPr id="14" name="run_boolean" descr="Boolean model: news websites (khabar) about Kathmandu, without “post”." title="Boolean model: news websites (khabar) about Kathmandu, without “post”."/>
@@ -9479,7 +9478,7 @@
       <w:pPr>
         <w:pStyle w:val="Heading2"/>
       </w:pPr>
-      <w:bookmarkStart w:id="22" w:name="_Toc242696117"/>
+      <w:bookmarkStart w:id="22" w:name="_Toc242699570"/>
       <w:r>
         <w:t>5.6 The same query with two models</w:t>
       </w:r>
@@ -9527,7 +9526,7 @@
         </w:rPr>
         <w:lastRenderedPageBreak/>
         <w:drawing>
-          <wp:inline distT="0" distB="0" distL="0" distR="0" wp14:anchorId="189F2E70" wp14:editId="2DC53683">
+          <wp:inline distT="0" distB="0" distL="0" distR="0" wp14:anchorId="47132D78" wp14:editId="45C441EA">
             <wp:extent cx="5715000" cy="1552575"/>
             <wp:effectExtent l="0" t="0" r="0" b="0"/>
             <wp:docPr id="15" name="run_tfidf" descr="TF-IDF: short documents with “gandaki” in the address win." title="TF-IDF: short documents with “gandaki” in the address win."/>
@@ -9601,7 +9600,7 @@
           <w:noProof/>
         </w:rPr>
         <w:drawing>
-          <wp:inline distT="0" distB="0" distL="0" distR="0" wp14:anchorId="01C8FF6F" wp14:editId="16FBEF83">
+          <wp:inline distT="0" distB="0" distL="0" distR="0" wp14:anchorId="15218860" wp14:editId="42798099">
             <wp:extent cx="5715000" cy="1552575"/>
             <wp:effectExtent l="0" t="0" r="0" b="0"/>
             <wp:docPr id="16" name="run_bm25_same" descr="BM25F: the province and its districts rank higher." title="BM25F: the province and its districts rank higher."/>
@@ -9668,7 +9667,7 @@
       <w:pPr>
         <w:pStyle w:val="Heading2"/>
       </w:pPr>
-      <w:bookmarkStart w:id="23" w:name="_Toc242696118"/>
+      <w:bookmarkStart w:id="23" w:name="_Toc242699571"/>
       <w:r>
         <w:t>5.7 Invalid input</w:t>
       </w:r>
@@ -9685,7 +9684,7 @@
           <w:noProof/>
         </w:rPr>
         <w:drawing>
-          <wp:inline distT="0" distB="0" distL="0" distR="0" wp14:anchorId="5A20322F" wp14:editId="20320B65">
+          <wp:inline distT="0" distB="0" distL="0" distR="0" wp14:anchorId="4A47507D" wp14:editId="2CE79C42">
             <wp:extent cx="5715000" cy="466725"/>
             <wp:effectExtent l="0" t="0" r="0" b="0"/>
             <wp:docPr id="17" name="run_invalid" descr="Unknown places in filters are rejected with a clear message." title="Unknown places in filters are rejected with a clear message."/>
@@ -9753,7 +9752,7 @@
         <w:pStyle w:val="Heading1"/>
         <w:pageBreakBefore/>
       </w:pPr>
-      <w:bookmarkStart w:id="24" w:name="_Toc242696119"/>
+      <w:bookmarkStart w:id="24" w:name="_Toc242699572"/>
       <w:r>
         <w:lastRenderedPageBreak/>
         <w:t>6. Evaluation</w:t>
@@ -9764,7 +9763,7 @@
       <w:pPr>
         <w:pStyle w:val="Heading2"/>
       </w:pPr>
-      <w:bookmarkStart w:id="25" w:name="_Toc242696120"/>
+      <w:bookmarkStart w:id="25" w:name="_Toc242699573"/>
       <w:r>
         <w:t>6.1 Method</w:t>
       </w:r>
@@ -10759,7 +10758,7 @@
           <w:noProof/>
         </w:rPr>
         <w:drawing>
-          <wp:inline distT="0" distB="0" distL="0" distR="0" wp14:anchorId="3AEBDEC2" wp14:editId="05CD93BE">
+          <wp:inline distT="0" distB="0" distL="0" distR="0" wp14:anchorId="4C626971" wp14:editId="7673E93E">
             <wp:extent cx="5715000" cy="2676525"/>
             <wp:effectExtent l="0" t="0" r="0" b="0"/>
             <wp:docPr id="18" name="code_metrics" descr="Implementation of the measures." title="Implementation of the measures."/>
@@ -10826,7 +10825,7 @@
       <w:pPr>
         <w:pStyle w:val="Heading2"/>
       </w:pPr>
-      <w:bookmarkStart w:id="26" w:name="_Toc242696121"/>
+      <w:bookmarkStart w:id="26" w:name="_Toc242699574"/>
       <w:r>
         <w:lastRenderedPageBreak/>
         <w:t>6.2 Overall results</w:t>
@@ -12351,7 +12350,7 @@
           <w:noProof/>
         </w:rPr>
         <w:drawing>
-          <wp:inline distT="0" distB="0" distL="0" distR="0" wp14:anchorId="3AA99CA4" wp14:editId="17EB1766">
+          <wp:inline distT="0" distB="0" distL="0" distR="0" wp14:anchorId="57C7DD84" wp14:editId="298A03AC">
             <wp:extent cx="5715000" cy="2628900"/>
             <wp:effectExtent l="0" t="0" r="0" b="0"/>
             <wp:docPr id="19" name="chart_overall" descr="Overall scores of each run." title="Overall scores of each run."/>
@@ -12418,7 +12417,7 @@
       <w:pPr>
         <w:pStyle w:val="Heading2"/>
       </w:pPr>
-      <w:bookmarkStart w:id="27" w:name="_Toc242696122"/>
+      <w:bookmarkStart w:id="27" w:name="_Toc242699575"/>
       <w:r>
         <w:t>6.3 Results by query group</w:t>
       </w:r>
@@ -12435,7 +12434,7 @@
           <w:noProof/>
         </w:rPr>
         <w:drawing>
-          <wp:inline distT="0" distB="0" distL="0" distR="0" wp14:anchorId="30ED5309" wp14:editId="1B9755D7">
+          <wp:inline distT="0" distB="0" distL="0" distR="0" wp14:anchorId="2EBB947C" wp14:editId="6D3C18F5">
             <wp:extent cx="5715000" cy="2628900"/>
             <wp:effectExtent l="0" t="0" r="0" b="0"/>
             <wp:docPr id="20" name="chart_groups" descr="MAP of each run in each query group." title="MAP of each run in each query group."/>
@@ -17719,7 +17718,7 @@
       <w:pPr>
         <w:pStyle w:val="Heading2"/>
       </w:pPr>
-      <w:bookmarkStart w:id="28" w:name="_Toc242696123"/>
+      <w:bookmarkStart w:id="28" w:name="_Toc242699576"/>
       <w:r>
         <w:lastRenderedPageBreak/>
         <w:t>6.4 Ablation: word segmentation</w:t>
@@ -18068,7 +18067,7 @@
         <w:pStyle w:val="Heading1"/>
         <w:pageBreakBefore/>
       </w:pPr>
-      <w:bookmarkStart w:id="29" w:name="_Toc242696124"/>
+      <w:bookmarkStart w:id="29" w:name="_Toc242699577"/>
       <w:r>
         <w:lastRenderedPageBreak/>
         <w:t>7. Discussion</w:t>
@@ -18079,7 +18078,7 @@
       <w:pPr>
         <w:pStyle w:val="Heading2"/>
       </w:pPr>
-      <w:bookmarkStart w:id="30" w:name="_Toc242696125"/>
+      <w:bookmarkStart w:id="30" w:name="_Toc242699578"/>
       <w:r>
         <w:t>7.1 Findings</w:t>
       </w:r>
@@ -18229,7 +18228,7 @@
       <w:pPr>
         <w:pStyle w:val="Heading2"/>
       </w:pPr>
-      <w:bookmarkStart w:id="31" w:name="_Toc242696126"/>
+      <w:bookmarkStart w:id="31" w:name="_Toc242699579"/>
       <w:r>
         <w:t>7.2 Limitations</w:t>
       </w:r>
@@ -18304,7 +18303,7 @@
       <w:pPr>
         <w:pStyle w:val="Heading2"/>
       </w:pPr>
-      <w:bookmarkStart w:id="32" w:name="_Toc242696127"/>
+      <w:bookmarkStart w:id="32" w:name="_Toc242699580"/>
       <w:r>
         <w:t>7.3 Possible improvements</w:t>
       </w:r>
@@ -18367,7 +18366,7 @@
         <w:pStyle w:val="Heading1"/>
         <w:pageBreakBefore/>
       </w:pPr>
-      <w:bookmarkStart w:id="33" w:name="_Toc242696128"/>
+      <w:bookmarkStart w:id="33" w:name="_Toc242699581"/>
       <w:r>
         <w:lastRenderedPageBreak/>
         <w:t>8. Relation to the PGS Search Engine</w:t>
@@ -19330,7 +19329,7 @@
         <w:pStyle w:val="Heading1"/>
         <w:pageBreakBefore/>
       </w:pPr>
-      <w:bookmarkStart w:id="34" w:name="_Toc242696129"/>
+      <w:bookmarkStart w:id="34" w:name="_Toc242699582"/>
       <w:r>
         <w:lastRenderedPageBreak/>
         <w:t>9. Conclusion</w:t>
@@ -19352,7 +19351,7 @@
       <w:pPr>
         <w:pStyle w:val="Heading2"/>
       </w:pPr>
-      <w:bookmarkStart w:id="35" w:name="_Toc242696130"/>
+      <w:bookmarkStart w:id="35" w:name="_Toc242699583"/>
       <w:r>
         <w:t>9.1 Code and how to run it</w:t>
       </w:r>
@@ -19375,7 +19374,7 @@
             <w:rStyle w:val="Hyperlink"/>
             <w:highlight w:val="yellow"/>
           </w:rPr>
-          <w:t>https://github.com/&lt;your-username&gt;/pgs-ir-assignment</w:t>
+          <w:t>https://github.com/Prijesh77/pgs-ir-assignment</w:t>
         </w:r>
       </w:hyperlink>
     </w:p>
@@ -19480,7 +19479,7 @@
           <w:noProof/>
         </w:rPr>
         <w:drawing>
-          <wp:inline distT="0" distB="0" distL="0" distR="0" wp14:anchorId="17C4DD38" wp14:editId="76676516">
+          <wp:inline distT="0" distB="0" distL="0" distR="0" wp14:anchorId="35966CE2" wp14:editId="66DBF9EF">
             <wp:extent cx="5715000" cy="571500"/>
             <wp:effectExtent l="0" t="0" r="0" b="0"/>
             <wp:docPr id="21" name="run_tests" descr="All 21 unit tests pass." title="All 21 unit tests pass."/>
@@ -19753,96 +19752,64 @@
 <file path=word/numbering.xml><?xml version="1.0" encoding="utf-8"?>
 <w:numbering xmlns:wpc="http://schemas.microsoft.com/office/word/2010/wordprocessingCanvas" xmlns:cx="http://schemas.microsoft.com/office/drawing/2014/chartex" xmlns:cx1="http://schemas.microsoft.com/office/drawing/2015/9/8/chartex" xmlns:cx2="http://schemas.microsoft.com/office/drawing/2015/10/21/chartex" xmlns:cx3="http://schemas.microsoft.com/office/drawing/2016/5/9/chartex" xmlns:cx4="http://schemas.microsoft.com/office/drawing/2016/5/10/chartex" xmlns:cx5="http://schemas.microsoft.com/office/drawing/2016/5/11/chartex" xmlns:cx6="http://schemas.microsoft.com/office/drawing/2016/5/12/chartex" xmlns:cx7="http://schemas.microsoft.com/office/drawing/2016/5/13/chartex" xmlns:cx8="http://schemas.microsoft.com/office/drawing/2016/5/14/chartex" xmlns:mc="http://schemas.openxmlformats.org/markup-compatibility/2006" xmlns:aink="http://schemas.microsoft.com/office/drawing/2016/ink" xmlns:am3d="http://schemas.microsoft.com/office/drawing/2017/model3d" xmlns:o="urn:schemas-microsoft-com:office:office" xmlns:oel="http://schemas.microsoft.com/office/2019/extlst" xmlns:r="http://schemas.openxmlformats.org/officeDocument/2006/relationships" xmlns:m="http://schemas.openxmlformats.org/officeDocument/2006/math" xmlns:v="urn:schemas-microsoft-com:vml" xmlns:wp14="http://schemas.microsoft.com/office/word/2010/wordprocessingDrawing" xmlns:wp="http://schemas.openxmlformats.org/drawingml/2006/wordprocessingDrawing" xmlns:w10="urn:schemas-microsoft-com:office:word" xmlns:w="http://schemas.openxmlformats.org/wordprocessingml/2006/main" xmlns:w14="http://schemas.microsoft.com/office/word/2010/wordml" xmlns:w15="http://schemas.microsoft.com/office/word/2012/wordml" xmlns:w16cex="http://schemas.microsoft.com/office/word/2018/wordml/cex" xmlns:w16cid="http://schemas.microsoft.com/office/word/2016/wordml/cid" xmlns:w16="http://schemas.microsoft.com/office/word/2018/wordml" xmlns:w16sdtdh="http://schemas.microsoft.com/office/word/2020/wordml/sdtdatahash" xmlns:w16se="http://schemas.microsoft.com/office/word/2015/wordml/symex" xmlns:wpg="http://schemas.microsoft.com/office/word/2010/wordprocessingGroup" xmlns:wpi="http://schemas.microsoft.com/office/word/2010/wordprocessingInk" xmlns:wne="http://schemas.microsoft.com/office/word/2006/wordml" xmlns:wps="http://schemas.microsoft.com/office/word/2010/wordprocessingShape" mc:Ignorable="w14 w15 w16se w16cid w16 w16cex w16sdtdh wp14">
   <w:abstractNum w:abstractNumId="0" w15:restartNumberingAfterBreak="0">
-    <w:nsid w:val="3795083F"/>
+    <w:nsid w:val="2CF868B0"/>
     <w:multiLevelType w:val="hybridMultilevel"/>
-    <w:tmpl w:val="FC12E1C4"/>
-    <w:lvl w:ilvl="0" w:tplc="B8B81C34" w:tentative="1">
+    <w:tmpl w:val="067410D2"/>
+    <w:lvl w:ilvl="0" w:tplc="838AE64C">
       <w:start w:val="1"/>
       <w:numFmt w:val="bullet"/>
-      <w:lvlText w:val="●"/>
+      <w:lvlText w:val="•"/>
       <w:lvlJc w:val="left"/>
       <w:pPr>
-        <w:ind w:left="720" w:hanging="360"/>
+        <w:ind w:left="540" w:hanging="270"/>
       </w:pPr>
     </w:lvl>
-    <w:lvl w:ilvl="1" w:tplc="41888AA2" w:tentative="1">
-      <w:start w:val="1"/>
-      <w:numFmt w:val="bullet"/>
-      <w:lvlText w:val="○"/>
+    <w:lvl w:ilvl="1" w:tplc="AD10B540">
+      <w:numFmt w:val="decimal"/>
+      <w:lvlText w:val=""/>
       <w:lvlJc w:val="left"/>
-      <w:pPr>
-        <w:ind w:left="1440" w:hanging="360"/>
-      </w:pPr>
     </w:lvl>
-    <w:lvl w:ilvl="2" w:tplc="D17CF9A2" w:tentative="1">
-      <w:start w:val="1"/>
-      <w:numFmt w:val="bullet"/>
-      <w:lvlText w:val="■"/>
+    <w:lvl w:ilvl="2" w:tplc="F9E2F27C">
+      <w:numFmt w:val="decimal"/>
+      <w:lvlText w:val=""/>
       <w:lvlJc w:val="left"/>
-      <w:pPr>
-        <w:ind w:left="2160" w:hanging="360"/>
-      </w:pPr>
     </w:lvl>
-    <w:lvl w:ilvl="3" w:tplc="7A463F56" w:tentative="1">
-      <w:start w:val="1"/>
-      <w:numFmt w:val="bullet"/>
-      <w:lvlText w:val="●"/>
+    <w:lvl w:ilvl="3" w:tplc="036489E0">
+      <w:numFmt w:val="decimal"/>
+      <w:lvlText w:val=""/>
       <w:lvlJc w:val="left"/>
-      <w:pPr>
-        <w:ind w:left="2880" w:hanging="360"/>
-      </w:pPr>
     </w:lvl>
-    <w:lvl w:ilvl="4" w:tplc="26366ADC" w:tentative="1">
-      <w:start w:val="1"/>
-      <w:numFmt w:val="bullet"/>
-      <w:lvlText w:val="○"/>
+    <w:lvl w:ilvl="4" w:tplc="F1C229E4">
+      <w:numFmt w:val="decimal"/>
+      <w:lvlText w:val=""/>
       <w:lvlJc w:val="left"/>
-      <w:pPr>
-        <w:ind w:left="3600" w:hanging="360"/>
-      </w:pPr>
     </w:lvl>
-    <w:lvl w:ilvl="5" w:tplc="F11EBA20" w:tentative="1">
-      <w:start w:val="1"/>
-      <w:numFmt w:val="bullet"/>
-      <w:lvlText w:val="■"/>
+    <w:lvl w:ilvl="5" w:tplc="9C70258E">
+      <w:numFmt w:val="decimal"/>
+      <w:lvlText w:val=""/>
       <w:lvlJc w:val="left"/>
-      <w:pPr>
-        <w:ind w:left="4320" w:hanging="360"/>
-      </w:pPr>
     </w:lvl>
-    <w:lvl w:ilvl="6" w:tplc="F6E2BD44" w:tentative="1">
-      <w:start w:val="1"/>
-      <w:numFmt w:val="bullet"/>
-      <w:lvlText w:val="●"/>
+    <w:lvl w:ilvl="6" w:tplc="341EB694">
+      <w:numFmt w:val="decimal"/>
+      <w:lvlText w:val=""/>
       <w:lvlJc w:val="left"/>
-      <w:pPr>
-        <w:ind w:left="5040" w:hanging="360"/>
-      </w:pPr>
     </w:lvl>
-    <w:lvl w:ilvl="7" w:tplc="89E815F8" w:tentative="1">
-      <w:start w:val="1"/>
-      <w:numFmt w:val="bullet"/>
-      <w:lvlText w:val="●"/>
+    <w:lvl w:ilvl="7" w:tplc="BD7A7654">
+      <w:numFmt w:val="decimal"/>
+      <w:lvlText w:val=""/>
       <w:lvlJc w:val="left"/>
-      <w:pPr>
-        <w:ind w:left="5760" w:hanging="360"/>
-      </w:pPr>
     </w:lvl>
-    <w:lvl w:ilvl="8" w:tplc="2E04ADB6" w:tentative="1">
-      <w:start w:val="1"/>
-      <w:numFmt w:val="bullet"/>
-      <w:lvlText w:val="●"/>
+    <w:lvl w:ilvl="8" w:tplc="F6D4C9F0">
+      <w:numFmt w:val="decimal"/>
+      <w:lvlText w:val=""/>
       <w:lvlJc w:val="left"/>
-      <w:pPr>
-        <w:ind w:left="6480" w:hanging="360"/>
-      </w:pPr>
     </w:lvl>
   </w:abstractNum>
   <w:abstractNum w:abstractNumId="1" w15:restartNumberingAfterBreak="0">
-    <w:nsid w:val="4AD63079"/>
+    <w:nsid w:val="578B2CE4"/>
     <w:multiLevelType w:val="hybridMultilevel"/>
-    <w:tmpl w:val="A74A6898"/>
-    <w:lvl w:ilvl="0" w:tplc="EC70100C">
+    <w:tmpl w:val="BBA88DEE"/>
+    <w:lvl w:ilvl="0" w:tplc="7B141FE6">
       <w:start w:val="1"/>
       <w:numFmt w:val="decimal"/>
       <w:lvlText w:val="%1."/>
@@ -19851,126 +19818,158 @@
         <w:ind w:left="540" w:hanging="360"/>
       </w:pPr>
     </w:lvl>
-    <w:lvl w:ilvl="1" w:tplc="0348325C">
+    <w:lvl w:ilvl="1" w:tplc="2288071C">
       <w:numFmt w:val="decimal"/>
       <w:lvlText w:val=""/>
       <w:lvlJc w:val="left"/>
     </w:lvl>
-    <w:lvl w:ilvl="2" w:tplc="63B46F78">
+    <w:lvl w:ilvl="2" w:tplc="0FE04B26">
       <w:numFmt w:val="decimal"/>
       <w:lvlText w:val=""/>
       <w:lvlJc w:val="left"/>
     </w:lvl>
-    <w:lvl w:ilvl="3" w:tplc="C0749FE0">
+    <w:lvl w:ilvl="3" w:tplc="7CBEF72E">
       <w:numFmt w:val="decimal"/>
       <w:lvlText w:val=""/>
       <w:lvlJc w:val="left"/>
     </w:lvl>
-    <w:lvl w:ilvl="4" w:tplc="D180B0A6">
+    <w:lvl w:ilvl="4" w:tplc="35CE9754">
       <w:numFmt w:val="decimal"/>
       <w:lvlText w:val=""/>
       <w:lvlJc w:val="left"/>
     </w:lvl>
-    <w:lvl w:ilvl="5" w:tplc="75BC452A">
+    <w:lvl w:ilvl="5" w:tplc="FB0CC39E">
       <w:numFmt w:val="decimal"/>
       <w:lvlText w:val=""/>
       <w:lvlJc w:val="left"/>
     </w:lvl>
-    <w:lvl w:ilvl="6" w:tplc="CA60776E">
+    <w:lvl w:ilvl="6" w:tplc="F78EC440">
       <w:numFmt w:val="decimal"/>
       <w:lvlText w:val=""/>
       <w:lvlJc w:val="left"/>
     </w:lvl>
-    <w:lvl w:ilvl="7" w:tplc="342867E4">
+    <w:lvl w:ilvl="7" w:tplc="40403EB0">
       <w:numFmt w:val="decimal"/>
       <w:lvlText w:val=""/>
       <w:lvlJc w:val="left"/>
     </w:lvl>
-    <w:lvl w:ilvl="8" w:tplc="F4028F72">
+    <w:lvl w:ilvl="8" w:tplc="69E0523C">
       <w:numFmt w:val="decimal"/>
       <w:lvlText w:val=""/>
       <w:lvlJc w:val="left"/>
     </w:lvl>
   </w:abstractNum>
   <w:abstractNum w:abstractNumId="2" w15:restartNumberingAfterBreak="0">
-    <w:nsid w:val="68BC3EA0"/>
+    <w:nsid w:val="6593051E"/>
     <w:multiLevelType w:val="hybridMultilevel"/>
-    <w:tmpl w:val="958228B4"/>
-    <w:lvl w:ilvl="0" w:tplc="E1701714">
+    <w:tmpl w:val="05EEB974"/>
+    <w:lvl w:ilvl="0" w:tplc="1B3294D4" w:tentative="1">
       <w:start w:val="1"/>
       <w:numFmt w:val="bullet"/>
-      <w:lvlText w:val="•"/>
+      <w:lvlText w:val="●"/>
       <w:lvlJc w:val="left"/>
       <w:pPr>
-        <w:ind w:left="540" w:hanging="270"/>
+        <w:ind w:left="720" w:hanging="360"/>
       </w:pPr>
     </w:lvl>
-    <w:lvl w:ilvl="1" w:tplc="D880581A">
-      <w:numFmt w:val="decimal"/>
-      <w:lvlText w:val=""/>
+    <w:lvl w:ilvl="1" w:tplc="11B0FA1A" w:tentative="1">
+      <w:start w:val="1"/>
+      <w:numFmt w:val="bullet"/>
+      <w:lvlText w:val="○"/>
       <w:lvlJc w:val="left"/>
+      <w:pPr>
+        <w:ind w:left="1440" w:hanging="360"/>
+      </w:pPr>
     </w:lvl>
-    <w:lvl w:ilvl="2" w:tplc="4AC6E77A">
-      <w:numFmt w:val="decimal"/>
-      <w:lvlText w:val=""/>
+    <w:lvl w:ilvl="2" w:tplc="837E08FE" w:tentative="1">
+      <w:start w:val="1"/>
+      <w:numFmt w:val="bullet"/>
+      <w:lvlText w:val="■"/>
       <w:lvlJc w:val="left"/>
+      <w:pPr>
+        <w:ind w:left="2160" w:hanging="360"/>
+      </w:pPr>
     </w:lvl>
-    <w:lvl w:ilvl="3" w:tplc="C9A8ED04">
-      <w:numFmt w:val="decimal"/>
-      <w:lvlText w:val=""/>
+    <w:lvl w:ilvl="3" w:tplc="75E8D36C" w:tentative="1">
+      <w:start w:val="1"/>
+      <w:numFmt w:val="bullet"/>
+      <w:lvlText w:val="●"/>
       <w:lvlJc w:val="left"/>
+      <w:pPr>
+        <w:ind w:left="2880" w:hanging="360"/>
+      </w:pPr>
     </w:lvl>
-    <w:lvl w:ilvl="4" w:tplc="3A24FF80">
-      <w:numFmt w:val="decimal"/>
-      <w:lvlText w:val=""/>
+    <w:lvl w:ilvl="4" w:tplc="82CC4B9C" w:tentative="1">
+      <w:start w:val="1"/>
+      <w:numFmt w:val="bullet"/>
+      <w:lvlText w:val="○"/>
       <w:lvlJc w:val="left"/>
+      <w:pPr>
+        <w:ind w:left="3600" w:hanging="360"/>
+      </w:pPr>
     </w:lvl>
-    <w:lvl w:ilvl="5" w:tplc="7FCE65AC">
-      <w:numFmt w:val="decimal"/>
-      <w:lvlText w:val=""/>
+    <w:lvl w:ilvl="5" w:tplc="017A20C0" w:tentative="1">
+      <w:start w:val="1"/>
+      <w:numFmt w:val="bullet"/>
+      <w:lvlText w:val="■"/>
       <w:lvlJc w:val="left"/>
+      <w:pPr>
+        <w:ind w:left="4320" w:hanging="360"/>
+      </w:pPr>
     </w:lvl>
-    <w:lvl w:ilvl="6" w:tplc="D7709BCC">
-      <w:numFmt w:val="decimal"/>
-      <w:lvlText w:val=""/>
+    <w:lvl w:ilvl="6" w:tplc="BF2C8462" w:tentative="1">
+      <w:start w:val="1"/>
+      <w:numFmt w:val="bullet"/>
+      <w:lvlText w:val="●"/>
       <w:lvlJc w:val="left"/>
+      <w:pPr>
+        <w:ind w:left="5040" w:hanging="360"/>
+      </w:pPr>
     </w:lvl>
-    <w:lvl w:ilvl="7" w:tplc="6FEAECEE">
-      <w:numFmt w:val="decimal"/>
-      <w:lvlText w:val=""/>
+    <w:lvl w:ilvl="7" w:tplc="215E5C86" w:tentative="1">
+      <w:start w:val="1"/>
+      <w:numFmt w:val="bullet"/>
+      <w:lvlText w:val="●"/>
       <w:lvlJc w:val="left"/>
+      <w:pPr>
+        <w:ind w:left="5760" w:hanging="360"/>
+      </w:pPr>
     </w:lvl>
-    <w:lvl w:ilvl="8" w:tplc="ED06A0CA">
-      <w:numFmt w:val="decimal"/>
-      <w:lvlText w:val=""/>
+    <w:lvl w:ilvl="8" w:tplc="169EEF08" w:tentative="1">
+      <w:start w:val="1"/>
+      <w:numFmt w:val="bullet"/>
+      <w:lvlText w:val="●"/>
       <w:lvlJc w:val="left"/>
+      <w:pPr>
+        <w:ind w:left="6480" w:hanging="360"/>
+      </w:pPr>
     </w:lvl>
   </w:abstractNum>
-  <w:num w:numId="1" w16cid:durableId="1684284539">
+  <w:num w:numId="1" w16cid:durableId="635991236">
+    <w:abstractNumId w:val="2"/>
+    <w:lvlOverride w:ilvl="0">
+      <w:startOverride w:val="1"/>
+    </w:lvlOverride>
+  </w:num>
+  <w:num w:numId="2" w16cid:durableId="535049859">
     <w:abstractNumId w:val="0"/>
     <w:lvlOverride w:ilvl="0">
       <w:startOverride w:val="1"/>
     </w:lvlOverride>
   </w:num>
-  <w:num w:numId="2" w16cid:durableId="2103261186">
-    <w:abstractNumId w:val="2"/>
-    <w:lvlOverride w:ilvl="0">
-      <w:startOverride w:val="1"/>
-    </w:lvlOverride>
-  </w:num>
-  <w:num w:numId="3" w16cid:durableId="607935241">
+  <w:num w:numId="3" w16cid:durableId="1038436337">
     <w:abstractNumId w:val="1"/>
     <w:lvlOverride w:ilvl="0">
       <w:startOverride w:val="1"/>
     </w:lvlOverride>
   </w:num>
-  <w:num w:numId="4" w16cid:durableId="1844515562">
+  <w:num w:numId="4" w16cid:durableId="1073628138">
     <w:abstractNumId w:val="1"/>
     <w:lvlOverride w:ilvl="0">
       <w:startOverride w:val="1"/>
     </w:lvlOverride>
   </w:num>
-  <w:num w:numId="5" w16cid:durableId="1092815848">
+  <w:num w:numId="5" w16cid:durableId="2057316340">
     <w:abstractNumId w:val="1"/>
     <w:lvlOverride w:ilvl="0">
       <w:startOverride w:val="1"/>
@@ -20612,7 +20611,7 @@
     <w:autoRedefine/>
     <w:uiPriority w:val="39"/>
     <w:unhideWhenUsed/>
-    <w:rsid w:val="00196D31"/>
+    <w:rsid w:val="00271055"/>
     <w:pPr>
       <w:spacing w:after="100"/>
     </w:pPr>
@@ -20624,7 +20623,7 @@
     <w:autoRedefine/>
     <w:uiPriority w:val="39"/>
     <w:unhideWhenUsed/>
-    <w:rsid w:val="00196D31"/>
+    <w:rsid w:val="00271055"/>
     <w:pPr>
       <w:spacing w:after="100"/>
       <w:ind w:left="220"/>

</xml_diff>